<commit_message>
envoie du file avisGit
</commit_message>
<xml_diff>
--- a/avisGit.docx
+++ b/avisGit.docx
@@ -4,28 +4,15 @@
   <w:body>
     <w:p>
       <w:r>
-        <w:t xml:space="preserve">Git est un lieu pour exécuter des lignes de code qui peuvent communiquer avec </w:t>
+        <w:t xml:space="preserve">Git est </w:t>
       </w:r>
       <w:proofErr w:type="spellStart"/>
       <w:r>
-        <w:t>gitHub</w:t>
+        <w:t>interpreteur</w:t>
       </w:r>
       <w:proofErr w:type="spellEnd"/>
       <w:r>
-        <w:t xml:space="preserve">. </w:t>
-      </w:r>
-    </w:p>
-    <w:p>
-      <w:r>
-        <w:t>GitHub est un serveur en ligne qui permet d’</w:t>
-      </w:r>
-      <w:proofErr w:type="spellStart"/>
-      <w:r>
-        <w:t>heberger</w:t>
-      </w:r>
-      <w:proofErr w:type="spellEnd"/>
-      <w:r>
-        <w:t xml:space="preserve"> des projets et documents </w:t>
+        <w:t xml:space="preserve"> de commande </w:t>
       </w:r>
     </w:p>
     <w:sectPr>
@@ -446,7 +433,7 @@
     <w:link w:val="Titre1Car"/>
     <w:uiPriority w:val="9"/>
     <w:qFormat/>
-    <w:rsid w:val="008D1FBD"/>
+    <w:rsid w:val="006053AF"/>
     <w:pPr>
       <w:keepNext/>
       <w:keepLines/>
@@ -469,7 +456,7 @@
     <w:semiHidden/>
     <w:unhideWhenUsed/>
     <w:qFormat/>
-    <w:rsid w:val="008D1FBD"/>
+    <w:rsid w:val="006053AF"/>
     <w:pPr>
       <w:keepNext/>
       <w:keepLines/>
@@ -492,7 +479,7 @@
     <w:semiHidden/>
     <w:unhideWhenUsed/>
     <w:qFormat/>
-    <w:rsid w:val="008D1FBD"/>
+    <w:rsid w:val="006053AF"/>
     <w:pPr>
       <w:keepNext/>
       <w:keepLines/>
@@ -515,7 +502,7 @@
     <w:semiHidden/>
     <w:unhideWhenUsed/>
     <w:qFormat/>
-    <w:rsid w:val="008D1FBD"/>
+    <w:rsid w:val="006053AF"/>
     <w:pPr>
       <w:keepNext/>
       <w:keepLines/>
@@ -538,7 +525,7 @@
     <w:semiHidden/>
     <w:unhideWhenUsed/>
     <w:qFormat/>
-    <w:rsid w:val="008D1FBD"/>
+    <w:rsid w:val="006053AF"/>
     <w:pPr>
       <w:keepNext/>
       <w:keepLines/>
@@ -559,7 +546,7 @@
     <w:semiHidden/>
     <w:unhideWhenUsed/>
     <w:qFormat/>
-    <w:rsid w:val="008D1FBD"/>
+    <w:rsid w:val="006053AF"/>
     <w:pPr>
       <w:keepNext/>
       <w:keepLines/>
@@ -582,7 +569,7 @@
     <w:semiHidden/>
     <w:unhideWhenUsed/>
     <w:qFormat/>
-    <w:rsid w:val="008D1FBD"/>
+    <w:rsid w:val="006053AF"/>
     <w:pPr>
       <w:keepNext/>
       <w:keepLines/>
@@ -603,7 +590,7 @@
     <w:semiHidden/>
     <w:unhideWhenUsed/>
     <w:qFormat/>
-    <w:rsid w:val="008D1FBD"/>
+    <w:rsid w:val="006053AF"/>
     <w:pPr>
       <w:keepNext/>
       <w:keepLines/>
@@ -626,7 +613,7 @@
     <w:semiHidden/>
     <w:unhideWhenUsed/>
     <w:qFormat/>
-    <w:rsid w:val="008D1FBD"/>
+    <w:rsid w:val="006053AF"/>
     <w:pPr>
       <w:keepNext/>
       <w:keepLines/>
@@ -670,7 +657,7 @@
     <w:basedOn w:val="Policepardfaut"/>
     <w:link w:val="Titre1"/>
     <w:uiPriority w:val="9"/>
-    <w:rsid w:val="008D1FBD"/>
+    <w:rsid w:val="006053AF"/>
     <w:rPr>
       <w:rFonts w:asciiTheme="majorHAnsi" w:eastAsiaTheme="majorEastAsia" w:hAnsiTheme="majorHAnsi" w:cstheme="majorBidi"/>
       <w:color w:val="2F5496" w:themeColor="accent1" w:themeShade="BF"/>
@@ -684,7 +671,7 @@
     <w:link w:val="Titre2"/>
     <w:uiPriority w:val="9"/>
     <w:semiHidden/>
-    <w:rsid w:val="008D1FBD"/>
+    <w:rsid w:val="006053AF"/>
     <w:rPr>
       <w:rFonts w:asciiTheme="majorHAnsi" w:eastAsiaTheme="majorEastAsia" w:hAnsiTheme="majorHAnsi" w:cstheme="majorBidi"/>
       <w:color w:val="2F5496" w:themeColor="accent1" w:themeShade="BF"/>
@@ -698,7 +685,7 @@
     <w:link w:val="Titre3"/>
     <w:uiPriority w:val="9"/>
     <w:semiHidden/>
-    <w:rsid w:val="008D1FBD"/>
+    <w:rsid w:val="006053AF"/>
     <w:rPr>
       <w:rFonts w:eastAsiaTheme="majorEastAsia" w:cstheme="majorBidi"/>
       <w:color w:val="2F5496" w:themeColor="accent1" w:themeShade="BF"/>
@@ -712,7 +699,7 @@
     <w:link w:val="Titre4"/>
     <w:uiPriority w:val="9"/>
     <w:semiHidden/>
-    <w:rsid w:val="008D1FBD"/>
+    <w:rsid w:val="006053AF"/>
     <w:rPr>
       <w:rFonts w:eastAsiaTheme="majorEastAsia" w:cstheme="majorBidi"/>
       <w:i/>
@@ -726,7 +713,7 @@
     <w:link w:val="Titre5"/>
     <w:uiPriority w:val="9"/>
     <w:semiHidden/>
-    <w:rsid w:val="008D1FBD"/>
+    <w:rsid w:val="006053AF"/>
     <w:rPr>
       <w:rFonts w:eastAsiaTheme="majorEastAsia" w:cstheme="majorBidi"/>
       <w:color w:val="2F5496" w:themeColor="accent1" w:themeShade="BF"/>
@@ -738,7 +725,7 @@
     <w:link w:val="Titre6"/>
     <w:uiPriority w:val="9"/>
     <w:semiHidden/>
-    <w:rsid w:val="008D1FBD"/>
+    <w:rsid w:val="006053AF"/>
     <w:rPr>
       <w:rFonts w:eastAsiaTheme="majorEastAsia" w:cstheme="majorBidi"/>
       <w:i/>
@@ -752,7 +739,7 @@
     <w:link w:val="Titre7"/>
     <w:uiPriority w:val="9"/>
     <w:semiHidden/>
-    <w:rsid w:val="008D1FBD"/>
+    <w:rsid w:val="006053AF"/>
     <w:rPr>
       <w:rFonts w:eastAsiaTheme="majorEastAsia" w:cstheme="majorBidi"/>
       <w:color w:val="595959" w:themeColor="text1" w:themeTint="A6"/>
@@ -764,7 +751,7 @@
     <w:link w:val="Titre8"/>
     <w:uiPriority w:val="9"/>
     <w:semiHidden/>
-    <w:rsid w:val="008D1FBD"/>
+    <w:rsid w:val="006053AF"/>
     <w:rPr>
       <w:rFonts w:eastAsiaTheme="majorEastAsia" w:cstheme="majorBidi"/>
       <w:i/>
@@ -778,7 +765,7 @@
     <w:link w:val="Titre9"/>
     <w:uiPriority w:val="9"/>
     <w:semiHidden/>
-    <w:rsid w:val="008D1FBD"/>
+    <w:rsid w:val="006053AF"/>
     <w:rPr>
       <w:rFonts w:eastAsiaTheme="majorEastAsia" w:cstheme="majorBidi"/>
       <w:color w:val="272727" w:themeColor="text1" w:themeTint="D8"/>
@@ -791,7 +778,7 @@
     <w:link w:val="TitreCar"/>
     <w:uiPriority w:val="10"/>
     <w:qFormat/>
-    <w:rsid w:val="008D1FBD"/>
+    <w:rsid w:val="006053AF"/>
     <w:pPr>
       <w:spacing w:after="80" w:line="240" w:lineRule="auto"/>
       <w:contextualSpacing/>
@@ -809,7 +796,7 @@
     <w:basedOn w:val="Policepardfaut"/>
     <w:link w:val="Titre"/>
     <w:uiPriority w:val="10"/>
-    <w:rsid w:val="008D1FBD"/>
+    <w:rsid w:val="006053AF"/>
     <w:rPr>
       <w:rFonts w:asciiTheme="majorHAnsi" w:eastAsiaTheme="majorEastAsia" w:hAnsiTheme="majorHAnsi" w:cstheme="majorBidi"/>
       <w:spacing w:val="-10"/>
@@ -825,7 +812,7 @@
     <w:link w:val="Sous-titreCar"/>
     <w:uiPriority w:val="11"/>
     <w:qFormat/>
-    <w:rsid w:val="008D1FBD"/>
+    <w:rsid w:val="006053AF"/>
     <w:pPr>
       <w:numPr>
         <w:ilvl w:val="1"/>
@@ -844,7 +831,7 @@
     <w:basedOn w:val="Policepardfaut"/>
     <w:link w:val="Sous-titre"/>
     <w:uiPriority w:val="11"/>
-    <w:rsid w:val="008D1FBD"/>
+    <w:rsid w:val="006053AF"/>
     <w:rPr>
       <w:rFonts w:eastAsiaTheme="majorEastAsia" w:cstheme="majorBidi"/>
       <w:color w:val="595959" w:themeColor="text1" w:themeTint="A6"/>
@@ -860,7 +847,7 @@
     <w:link w:val="CitationCar"/>
     <w:uiPriority w:val="29"/>
     <w:qFormat/>
-    <w:rsid w:val="008D1FBD"/>
+    <w:rsid w:val="006053AF"/>
     <w:pPr>
       <w:spacing w:before="160"/>
       <w:jc w:val="center"/>
@@ -876,7 +863,7 @@
     <w:basedOn w:val="Policepardfaut"/>
     <w:link w:val="Citation"/>
     <w:uiPriority w:val="29"/>
-    <w:rsid w:val="008D1FBD"/>
+    <w:rsid w:val="006053AF"/>
     <w:rPr>
       <w:i/>
       <w:iCs/>
@@ -888,7 +875,7 @@
     <w:basedOn w:val="Normal"/>
     <w:uiPriority w:val="34"/>
     <w:qFormat/>
-    <w:rsid w:val="008D1FBD"/>
+    <w:rsid w:val="006053AF"/>
     <w:pPr>
       <w:ind w:left="720"/>
       <w:contextualSpacing/>
@@ -899,7 +886,7 @@
     <w:basedOn w:val="Policepardfaut"/>
     <w:uiPriority w:val="21"/>
     <w:qFormat/>
-    <w:rsid w:val="008D1FBD"/>
+    <w:rsid w:val="006053AF"/>
     <w:rPr>
       <w:i/>
       <w:iCs/>
@@ -913,7 +900,7 @@
     <w:link w:val="CitationintenseCar"/>
     <w:uiPriority w:val="30"/>
     <w:qFormat/>
-    <w:rsid w:val="008D1FBD"/>
+    <w:rsid w:val="006053AF"/>
     <w:pPr>
       <w:pBdr>
         <w:top w:val="single" w:sz="4" w:space="10" w:color="2F5496" w:themeColor="accent1" w:themeShade="BF"/>
@@ -934,7 +921,7 @@
     <w:basedOn w:val="Policepardfaut"/>
     <w:link w:val="Citationintense"/>
     <w:uiPriority w:val="30"/>
-    <w:rsid w:val="008D1FBD"/>
+    <w:rsid w:val="006053AF"/>
     <w:rPr>
       <w:i/>
       <w:iCs/>
@@ -946,7 +933,7 @@
     <w:basedOn w:val="Policepardfaut"/>
     <w:uiPriority w:val="32"/>
     <w:qFormat/>
-    <w:rsid w:val="008D1FBD"/>
+    <w:rsid w:val="006053AF"/>
     <w:rPr>
       <w:b/>
       <w:bCs/>

</xml_diff>